<commit_message>
new consolidated notebook for part 1
</commit_message>
<xml_diff>
--- a/DSA4213 A0282307H Assignment Report.docx
+++ b/DSA4213 A0282307H Assignment Report.docx
@@ -42,12 +42,35 @@
     </w:p>
     <w:p>
       <w:r>
-        <w:t>   - Architectures &amp; key hyperparameters (table)</w:t>
+        <w:t xml:space="preserve">   - Architectures &amp; key hyperparameters </w:t>
+      </w:r>
+      <w:r>
+        <w:t>Refer to Appendix for diagrams (RNN, LSTM and Transformer)</w:t>
       </w:r>
     </w:p>
     <w:p>
       <w:r>
         <w:t>   - Prediction quality: perplexity/cross-entropy table</w:t>
+      </w:r>
+    </w:p>
+    <w:p>
+      <w:r>
+        <w:t>For n-gram(n-3)</w:t>
+      </w:r>
+    </w:p>
+    <w:p>
+      <w:r>
+        <w:t>Best add_k found: 0.001</w:t>
+      </w:r>
+    </w:p>
+    <w:p>
+      <w:r>
+        <w:t>Test Cross-Entropy: 9.0991 bits/token</w:t>
+      </w:r>
+    </w:p>
+    <w:p>
+      <w:r>
+        <w:t>Test Perplexity: 548.4204</w:t>
       </w:r>
     </w:p>
     <w:p>
@@ -118,6 +141,7 @@
     </w:p>
     <w:p>
       <w:r>
+        <w:lastRenderedPageBreak/>
         <w:t>   - Metric table + a few representative errors</w:t>
       </w:r>
     </w:p>
@@ -142,7 +166,6 @@
         <w:pStyle w:val="Heading1"/>
       </w:pPr>
       <w:r>
-        <w:lastRenderedPageBreak/>
         <w:t>6. Appendices/References</w:t>
       </w:r>
     </w:p>

</xml_diff>